<commit_message>
update brief: launch strategy FREE + dinner first
</commit_message>
<xml_diff>
--- a/docs/developer_brief_final.docx
+++ b/docs/developer_brief_final.docx
@@ -48,7 +48,7 @@
           <w:sz w:val="23"/>
           <w:szCs w:val="23"/>
         </w:rPr>
-        <w:t xml:space="preserve">iOS &amp; Android &amp; iPad · React Native · Freemium · In-App Purchases</w:t>
+        <w:t xml:space="preserve">iOS &amp; Android · React Native · Freemium · In-App Purchases</w:t>
       </w:r>
     </w:p>
     <w:tbl>
@@ -374,6 +374,29 @@
         <w:t xml:space="preserve">1. החלטות מוצריות סופיות</w:t>
       </w:r>
     </w:p>
+    <w:p>
+      <w:pPr>
+        <w:spacing w:after="60" w:before="60"/>
+        <w:jc w:val="right"/>
+      </w:pPr>
+      <w:r>
+        <w:rPr>
+          <w:rFonts w:ascii="Arial" w:cs="Arial" w:eastAsia="Arial" w:hAnsi="Arial"/>
+          <w:color w:val="333333"/>
+          <w:sz w:val="22"/>
+          <w:szCs w:val="22"/>
+        </w:rPr>
+        <w:t xml:space="preserve">כל ההחלטות הבאות סגורות ומאושרות — אין שאלות פתוחות ל-MVP:</w:t>
+      </w:r>
+    </w:p>
+    <w:p>
+      <w:pPr>
+        <w:spacing w:before="80"/>
+      </w:pPr>
+      <w:r>
+        <w:t xml:space="preserve"/>
+      </w:r>
+    </w:p>
     <w:tbl>
       <w:tblPr>
         <w:tblW w:type="dxa" w:w="9026"/>
@@ -906,7 +929,7 @@
                 <w:sz w:val="21"/>
                 <w:szCs w:val="21"/>
               </w:rPr>
-              <w:t xml:space="preserve">שניהם זמינים</w:t>
+              <w:t xml:space="preserve">שניהם זמינים לבחירת המשתמש</w:t>
             </w:r>
           </w:p>
         </w:tc>
@@ -942,7 +965,7 @@
                 <w:sz w:val="21"/>
                 <w:szCs w:val="21"/>
               </w:rPr>
-              <w:t xml:space="preserve">introType — ערב</w:t>
+              <w:t xml:space="preserve">introType — Dinner</w:t>
             </w:r>
           </w:p>
         </w:tc>
@@ -1046,7 +1069,7 @@
                 <w:sz w:val="21"/>
                 <w:szCs w:val="21"/>
               </w:rPr>
-              <w:t xml:space="preserve">introType — בוקר</w:t>
+              <w:t xml:space="preserve">introType — Breakfast</w:t>
             </w:r>
           </w:p>
         </w:tc>
@@ -1150,7 +1173,7 @@
                 <w:sz w:val="21"/>
                 <w:szCs w:val="21"/>
               </w:rPr>
-              <w:t xml:space="preserve">introType — ניסויים</w:t>
+              <w:t xml:space="preserve">iPad</w:t>
             </w:r>
           </w:p>
         </w:tc>
@@ -1184,7 +1207,7 @@
                 <w:sz w:val="21"/>
                 <w:szCs w:val="21"/>
               </w:rPr>
-              <w:t xml:space="preserve">video</w:t>
+              <w:t xml:space="preserve">כן — נדרש</w:t>
             </w:r>
           </w:p>
         </w:tc>
@@ -1218,7 +1241,7 @@
                 <w:sz w:val="21"/>
                 <w:szCs w:val="21"/>
               </w:rPr>
-              <w:t xml:space="preserve">סרטון פתיחה</w:t>
+              <w:t xml:space="preserve">גם טאבלט וגם מובייל</w:t>
             </w:r>
           </w:p>
         </w:tc>
@@ -1254,7 +1277,7 @@
                 <w:sz w:val="21"/>
                 <w:szCs w:val="21"/>
               </w:rPr>
-              <w:t xml:space="preserve">iPad</w:t>
+              <w:t xml:space="preserve">Backend Phase 1</w:t>
             </w:r>
           </w:p>
         </w:tc>
@@ -1288,7 +1311,7 @@
                 <w:sz w:val="21"/>
                 <w:szCs w:val="21"/>
               </w:rPr>
-              <w:t xml:space="preserve">כן — נדרש</w:t>
+              <w:t xml:space="preserve">AsyncStorage מקומי</w:t>
             </w:r>
           </w:p>
         </w:tc>
@@ -1322,111 +1345,7 @@
                 <w:sz w:val="21"/>
                 <w:szCs w:val="21"/>
               </w:rPr>
-              <w:t xml:space="preserve">useWindowDimensions</w:t>
-            </w:r>
-          </w:p>
-        </w:tc>
-      </w:tr>
-      <w:tr>
-        <w:tc>
-          <w:tcPr>
-            <w:tcW w:type="dxa" w:w="3200"/>
-            <w:tcBorders>
-              <w:top w:val="single" w:color="DDDDDD" w:sz="1"/>
-              <w:left w:val="single" w:color="DDDDDD" w:sz="1"/>
-              <w:bottom w:val="single" w:color="DDDDDD" w:sz="1"/>
-              <w:right w:val="single" w:color="DDDDDD" w:sz="1"/>
-            </w:tcBorders>
-            <w:shd w:fill="f0f7f2" w:val="clear"/>
-            <w:tcMar>
-              <w:top w:type="dxa" w:w="80"/>
-              <w:left w:type="dxa" w:w="120"/>
-              <w:bottom w:type="dxa" w:w="80"/>
-              <w:right w:type="dxa" w:w="120"/>
-            </w:tcMar>
-          </w:tcPr>
-          <w:p>
-            <w:pPr>
-              <w:jc w:val="right"/>
-            </w:pPr>
-            <w:r>
-              <w:rPr>
-                <w:rFonts w:ascii="Arial" w:cs="Arial" w:eastAsia="Arial" w:hAnsi="Arial"/>
-                <w:b w:val="false"/>
-                <w:bCs w:val="false"/>
-                <w:color w:val="333333"/>
-                <w:sz w:val="21"/>
-                <w:szCs w:val="21"/>
-              </w:rPr>
-              <w:t xml:space="preserve">Backend Phase 1</w:t>
-            </w:r>
-          </w:p>
-        </w:tc>
-        <w:tc>
-          <w:tcPr>
-            <w:tcW w:type="dxa" w:w="2600"/>
-            <w:tcBorders>
-              <w:top w:val="single" w:color="DDDDDD" w:sz="1"/>
-              <w:left w:val="single" w:color="DDDDDD" w:sz="1"/>
-              <w:bottom w:val="single" w:color="DDDDDD" w:sz="1"/>
-              <w:right w:val="single" w:color="DDDDDD" w:sz="1"/>
-            </w:tcBorders>
-            <w:shd w:fill="f0f7f2" w:val="clear"/>
-            <w:tcMar>
-              <w:top w:type="dxa" w:w="80"/>
-              <w:left w:type="dxa" w:w="120"/>
-              <w:bottom w:type="dxa" w:w="80"/>
-              <w:right w:type="dxa" w:w="120"/>
-            </w:tcMar>
-          </w:tcPr>
-          <w:p>
-            <w:pPr>
-              <w:jc w:val="right"/>
-            </w:pPr>
-            <w:r>
-              <w:rPr>
-                <w:rFonts w:ascii="Arial" w:cs="Arial" w:eastAsia="Arial" w:hAnsi="Arial"/>
-                <w:b/>
-                <w:bCs/>
-                <w:color w:val="1a5e35"/>
-                <w:sz w:val="21"/>
-                <w:szCs w:val="21"/>
-              </w:rPr>
-              <w:t xml:space="preserve">AsyncStorage מקומי</w:t>
-            </w:r>
-          </w:p>
-        </w:tc>
-        <w:tc>
-          <w:tcPr>
-            <w:tcW w:type="dxa" w:w="3226"/>
-            <w:tcBorders>
-              <w:top w:val="single" w:color="DDDDDD" w:sz="1"/>
-              <w:left w:val="single" w:color="DDDDDD" w:sz="1"/>
-              <w:bottom w:val="single" w:color="DDDDDD" w:sz="1"/>
-              <w:right w:val="single" w:color="DDDDDD" w:sz="1"/>
-            </w:tcBorders>
-            <w:shd w:fill="f0f7f2" w:val="clear"/>
-            <w:tcMar>
-              <w:top w:type="dxa" w:w="80"/>
-              <w:left w:type="dxa" w:w="120"/>
-              <w:bottom w:type="dxa" w:w="80"/>
-              <w:right w:type="dxa" w:w="120"/>
-            </w:tcMar>
-          </w:tcPr>
-          <w:p>
-            <w:pPr>
-              <w:jc w:val="right"/>
-            </w:pPr>
-            <w:r>
-              <w:rPr>
-                <w:rFonts w:ascii="Arial" w:cs="Arial" w:eastAsia="Arial" w:hAnsi="Arial"/>
-                <w:b w:val="false"/>
-                <w:bCs w:val="false"/>
-                <w:color w:val="333333"/>
-                <w:sz w:val="21"/>
-                <w:szCs w:val="21"/>
-              </w:rPr>
-              <w:t xml:space="preserve">ללא שרת — ניתן לשדרג</w:t>
+              <w:t xml:space="preserve">ללא שרת — ניתן לשדרג בהמשך</w:t>
             </w:r>
           </w:p>
         </w:tc>
@@ -1583,12 +1502,12 @@
           <w:sz w:val="26"/>
           <w:szCs w:val="26"/>
         </w:rPr>
-        <w:t xml:space="preserve">חבילות MVP — 4 חבילות</w:t>
+        <w:t xml:space="preserve">חבילות MVP</w:t>
       </w:r>
     </w:p>
     <w:tbl>
       <w:tblPr>
-        <w:tblW w:type="dxa" w:w="8226"/>
+        <w:tblW w:type="dxa" w:w="8026"/>
         <w:tblBorders>
           <w:top w:val="single" w:color="auto" w:sz="4"/>
           <w:left w:val="single" w:color="auto" w:sz="4"/>
@@ -1599,17 +1518,16 @@
         </w:tblBorders>
       </w:tblPr>
       <w:tblGrid>
-        <w:gridCol w:w="500"/>
-        <w:gridCol w:w="3100"/>
+        <w:gridCol w:w="2800"/>
+        <w:gridCol w:w="1400"/>
         <w:gridCol w:w="1200"/>
-        <w:gridCol w:w="1100"/>
-        <w:gridCol w:w="1300"/>
-        <w:gridCol w:w="1026"/>
+        <w:gridCol w:w="1400"/>
+        <w:gridCol w:w="1226"/>
       </w:tblGrid>
       <w:tr>
         <w:tc>
           <w:tcPr>
-            <w:tcW w:type="dxa" w:w="500"/>
+            <w:tcW w:type="dxa" w:w="2800"/>
             <w:tcBorders>
               <w:top w:val="single" w:color="DDDDDD" w:sz="1"/>
               <w:left w:val="single" w:color="DDDDDD" w:sz="1"/>
@@ -1637,13 +1555,13 @@
                 <w:sz w:val="21"/>
                 <w:szCs w:val="21"/>
               </w:rPr>
-              <w:t xml:space="preserve">#</w:t>
-            </w:r>
-          </w:p>
-        </w:tc>
-        <w:tc>
-          <w:tcPr>
-            <w:tcW w:type="dxa" w:w="3100"/>
+              <w:t xml:space="preserve">חבילה</w:t>
+            </w:r>
+          </w:p>
+        </w:tc>
+        <w:tc>
+          <w:tcPr>
+            <w:tcW w:type="dxa" w:w="1400"/>
             <w:tcBorders>
               <w:top w:val="single" w:color="DDDDDD" w:sz="1"/>
               <w:left w:val="single" w:color="DDDDDD" w:sz="1"/>
@@ -1671,7 +1589,7 @@
                 <w:sz w:val="21"/>
                 <w:szCs w:val="21"/>
               </w:rPr>
-              <w:t xml:space="preserve">שם החבילה</w:t>
+              <w:t xml:space="preserve">introType</w:t>
             </w:r>
           </w:p>
         </w:tc>
@@ -1705,13 +1623,13 @@
                 <w:sz w:val="21"/>
                 <w:szCs w:val="21"/>
               </w:rPr>
-              <w:t xml:space="preserve">introType</w:t>
-            </w:r>
-          </w:p>
-        </w:tc>
-        <w:tc>
-          <w:tcPr>
-            <w:tcW w:type="dxa" w:w="1100"/>
+              <w:t xml:space="preserve">מתכונים</w:t>
+            </w:r>
+          </w:p>
+        </w:tc>
+        <w:tc>
+          <w:tcPr>
+            <w:tcW w:type="dxa" w:w="1400"/>
             <w:tcBorders>
               <w:top w:val="single" w:color="DDDDDD" w:sz="1"/>
               <w:left w:val="single" w:color="DDDDDD" w:sz="1"/>
@@ -1739,13 +1657,13 @@
                 <w:sz w:val="21"/>
                 <w:szCs w:val="21"/>
               </w:rPr>
-              <w:t xml:space="preserve">מתכונים</w:t>
-            </w:r>
-          </w:p>
-        </w:tc>
-        <w:tc>
-          <w:tcPr>
-            <w:tcW w:type="dxa" w:w="1300"/>
+              <w:t xml:space="preserve">משחקונים</w:t>
+            </w:r>
+          </w:p>
+        </w:tc>
+        <w:tc>
+          <w:tcPr>
+            <w:tcW w:type="dxa" w:w="1226"/>
             <w:tcBorders>
               <w:top w:val="single" w:color="DDDDDD" w:sz="1"/>
               <w:left w:val="single" w:color="DDDDDD" w:sz="1"/>
@@ -1773,40 +1691,6 @@
                 <w:sz w:val="21"/>
                 <w:szCs w:val="21"/>
               </w:rPr>
-              <w:t xml:space="preserve">משחקונים</w:t>
-            </w:r>
-          </w:p>
-        </w:tc>
-        <w:tc>
-          <w:tcPr>
-            <w:tcW w:type="dxa" w:w="1026"/>
-            <w:tcBorders>
-              <w:top w:val="single" w:color="DDDDDD" w:sz="1"/>
-              <w:left w:val="single" w:color="DDDDDD" w:sz="1"/>
-              <w:bottom w:val="single" w:color="DDDDDD" w:sz="1"/>
-              <w:right w:val="single" w:color="DDDDDD" w:sz="1"/>
-            </w:tcBorders>
-            <w:shd w:fill="1a5e35" w:val="clear"/>
-            <w:tcMar>
-              <w:top w:type="dxa" w:w="80"/>
-              <w:left w:type="dxa" w:w="120"/>
-              <w:bottom w:type="dxa" w:w="80"/>
-              <w:right w:type="dxa" w:w="120"/>
-            </w:tcMar>
-          </w:tcPr>
-          <w:p>
-            <w:pPr>
-              <w:jc w:val="right"/>
-            </w:pPr>
-            <w:r>
-              <w:rPr>
-                <w:rFonts w:ascii="Arial" w:cs="Arial" w:eastAsia="Arial" w:hAnsi="Arial"/>
-                <w:b/>
-                <w:bCs/>
-                <w:color w:val="FFFFFF"/>
-                <w:sz w:val="21"/>
-                <w:szCs w:val="21"/>
-              </w:rPr>
               <w:t xml:space="preserve">מחיר</w:t>
             </w:r>
           </w:p>
@@ -1815,7 +1699,7 @@
       <w:tr>
         <w:tc>
           <w:tcPr>
-            <w:tcW w:type="dxa" w:w="500"/>
+            <w:tcW w:type="dxa" w:w="2800"/>
             <w:tcBorders>
               <w:top w:val="single" w:color="DDDDDD" w:sz="1"/>
               <w:left w:val="single" w:color="DDDDDD" w:sz="1"/>
@@ -1843,13 +1727,13 @@
                 <w:sz w:val="21"/>
                 <w:szCs w:val="21"/>
               </w:rPr>
-              <w:t xml:space="preserve">FREE</w:t>
-            </w:r>
-          </w:p>
-        </w:tc>
-        <w:tc>
-          <w:tcPr>
-            <w:tcW w:type="dxa" w:w="3100"/>
+              <w:t xml:space="preserve">FREE — בואו נכיר את השף וביטו</w:t>
+            </w:r>
+          </w:p>
+        </w:tc>
+        <w:tc>
+          <w:tcPr>
+            <w:tcW w:type="dxa" w:w="1400"/>
             <w:tcBorders>
               <w:top w:val="single" w:color="DDDDDD" w:sz="1"/>
               <w:left w:val="single" w:color="DDDDDD" w:sz="1"/>
@@ -1877,7 +1761,7 @@
                 <w:sz w:val="21"/>
                 <w:szCs w:val="21"/>
               </w:rPr>
-              <w:t xml:space="preserve">בואו נכיר את השף הירוק וביטו הרובוט</w:t>
+              <w:t xml:space="preserve">video</w:t>
             </w:r>
           </w:p>
         </w:tc>
@@ -1911,13 +1795,13 @@
                 <w:sz w:val="21"/>
                 <w:szCs w:val="21"/>
               </w:rPr>
-              <w:t xml:space="preserve">video</w:t>
-            </w:r>
-          </w:p>
-        </w:tc>
-        <w:tc>
-          <w:tcPr>
-            <w:tcW w:type="dxa" w:w="1100"/>
+              <w:t xml:space="preserve">2</w:t>
+            </w:r>
+          </w:p>
+        </w:tc>
+        <w:tc>
+          <w:tcPr>
+            <w:tcW w:type="dxa" w:w="1400"/>
             <w:tcBorders>
               <w:top w:val="single" w:color="DDDDDD" w:sz="1"/>
               <w:left w:val="single" w:color="DDDDDD" w:sz="1"/>
@@ -1945,47 +1829,13 @@
                 <w:sz w:val="21"/>
                 <w:szCs w:val="21"/>
               </w:rPr>
-              <w:t xml:space="preserve">2</w:t>
-            </w:r>
-          </w:p>
-        </w:tc>
-        <w:tc>
-          <w:tcPr>
-            <w:tcW w:type="dxa" w:w="1300"/>
-            <w:tcBorders>
-              <w:top w:val="single" w:color="DDDDDD" w:sz="1"/>
-              <w:left w:val="single" w:color="DDDDDD" w:sz="1"/>
-              <w:bottom w:val="single" w:color="DDDDDD" w:sz="1"/>
-              <w:right w:val="single" w:color="DDDDDD" w:sz="1"/>
-            </w:tcBorders>
-            <w:shd w:fill="FFFFFF" w:val="clear"/>
-            <w:tcMar>
-              <w:top w:type="dxa" w:w="80"/>
-              <w:left w:type="dxa" w:w="120"/>
-              <w:bottom w:type="dxa" w:w="80"/>
-              <w:right w:type="dxa" w:w="120"/>
-            </w:tcMar>
-          </w:tcPr>
-          <w:p>
-            <w:pPr>
-              <w:jc w:val="right"/>
-            </w:pPr>
-            <w:r>
-              <w:rPr>
-                <w:rFonts w:ascii="Arial" w:cs="Arial" w:eastAsia="Arial" w:hAnsi="Arial"/>
-                <w:b w:val="false"/>
-                <w:bCs w:val="false"/>
-                <w:color w:val="333333"/>
-                <w:sz w:val="21"/>
-                <w:szCs w:val="21"/>
-              </w:rPr>
               <w:t xml:space="preserve">4</w:t>
             </w:r>
           </w:p>
         </w:tc>
         <w:tc>
           <w:tcPr>
-            <w:tcW w:type="dxa" w:w="1026"/>
+            <w:tcW w:type="dxa" w:w="1226"/>
             <w:tcBorders>
               <w:top w:val="single" w:color="DDDDDD" w:sz="1"/>
               <w:left w:val="single" w:color="DDDDDD" w:sz="1"/>
@@ -2021,7 +1871,7 @@
       <w:tr>
         <w:tc>
           <w:tcPr>
-            <w:tcW w:type="dxa" w:w="500"/>
+            <w:tcW w:type="dxa" w:w="2800"/>
             <w:tcBorders>
               <w:top w:val="single" w:color="DDDDDD" w:sz="1"/>
               <w:left w:val="single" w:color="DDDDDD" w:sz="1"/>
@@ -2049,13 +1899,13 @@
                 <w:sz w:val="21"/>
                 <w:szCs w:val="21"/>
               </w:rPr>
-              <w:t xml:space="preserve">1</w:t>
-            </w:r>
-          </w:p>
-        </w:tc>
-        <w:tc>
-          <w:tcPr>
-            <w:tcW w:type="dxa" w:w="3100"/>
+              <w:t xml:space="preserve">Dinner — תעלומת ארוחת הערב</w:t>
+            </w:r>
+          </w:p>
+        </w:tc>
+        <w:tc>
+          <w:tcPr>
+            <w:tcW w:type="dxa" w:w="1400"/>
             <w:tcBorders>
               <w:top w:val="single" w:color="DDDDDD" w:sz="1"/>
               <w:left w:val="single" w:color="DDDDDD" w:sz="1"/>
@@ -2083,7 +1933,7 @@
                 <w:sz w:val="21"/>
                 <w:szCs w:val="21"/>
               </w:rPr>
-              <w:t xml:space="preserve">ארוחות ערב שילדים אוהבים</w:t>
+              <w:t xml:space="preserve">video</w:t>
             </w:r>
           </w:p>
         </w:tc>
@@ -2117,13 +1967,13 @@
                 <w:sz w:val="21"/>
                 <w:szCs w:val="21"/>
               </w:rPr>
-              <w:t xml:space="preserve">video</w:t>
-            </w:r>
-          </w:p>
-        </w:tc>
-        <w:tc>
-          <w:tcPr>
-            <w:tcW w:type="dxa" w:w="1100"/>
+              <w:t xml:space="preserve">5</w:t>
+            </w:r>
+          </w:p>
+        </w:tc>
+        <w:tc>
+          <w:tcPr>
+            <w:tcW w:type="dxa" w:w="1400"/>
             <w:tcBorders>
               <w:top w:val="single" w:color="DDDDDD" w:sz="1"/>
               <w:left w:val="single" w:color="DDDDDD" w:sz="1"/>
@@ -2151,47 +2001,13 @@
                 <w:sz w:val="21"/>
                 <w:szCs w:val="21"/>
               </w:rPr>
-              <w:t xml:space="preserve">5</w:t>
-            </w:r>
-          </w:p>
-        </w:tc>
-        <w:tc>
-          <w:tcPr>
-            <w:tcW w:type="dxa" w:w="1300"/>
-            <w:tcBorders>
-              <w:top w:val="single" w:color="DDDDDD" w:sz="1"/>
-              <w:left w:val="single" w:color="DDDDDD" w:sz="1"/>
-              <w:bottom w:val="single" w:color="DDDDDD" w:sz="1"/>
-              <w:right w:val="single" w:color="DDDDDD" w:sz="1"/>
-            </w:tcBorders>
-            <w:shd w:fill="f0f7f2" w:val="clear"/>
-            <w:tcMar>
-              <w:top w:type="dxa" w:w="80"/>
-              <w:left w:type="dxa" w:w="120"/>
-              <w:bottom w:type="dxa" w:w="80"/>
-              <w:right w:type="dxa" w:w="120"/>
-            </w:tcMar>
-          </w:tcPr>
-          <w:p>
-            <w:pPr>
-              <w:jc w:val="right"/>
-            </w:pPr>
-            <w:r>
-              <w:rPr>
-                <w:rFonts w:ascii="Arial" w:cs="Arial" w:eastAsia="Arial" w:hAnsi="Arial"/>
-                <w:b w:val="false"/>
-                <w:bCs w:val="false"/>
-                <w:color w:val="333333"/>
-                <w:sz w:val="21"/>
-                <w:szCs w:val="21"/>
-              </w:rPr>
               <w:t xml:space="preserve">10</w:t>
             </w:r>
           </w:p>
         </w:tc>
         <w:tc>
           <w:tcPr>
-            <w:tcW w:type="dxa" w:w="1026"/>
+            <w:tcW w:type="dxa" w:w="1226"/>
             <w:tcBorders>
               <w:top w:val="single" w:color="DDDDDD" w:sz="1"/>
               <w:left w:val="single" w:color="DDDDDD" w:sz="1"/>
@@ -2227,7 +2043,7 @@
       <w:tr>
         <w:tc>
           <w:tcPr>
-            <w:tcW w:type="dxa" w:w="500"/>
+            <w:tcW w:type="dxa" w:w="2800"/>
             <w:tcBorders>
               <w:top w:val="single" w:color="DDDDDD" w:sz="1"/>
               <w:left w:val="single" w:color="DDDDDD" w:sz="1"/>
@@ -2255,13 +2071,13 @@
                 <w:sz w:val="21"/>
                 <w:szCs w:val="21"/>
               </w:rPr>
-              <w:t xml:space="preserve">2</w:t>
-            </w:r>
-          </w:p>
-        </w:tc>
-        <w:tc>
-          <w:tcPr>
-            <w:tcW w:type="dxa" w:w="3100"/>
+              <w:t xml:space="preserve">Breakfast — ארוחת בוקר קסומה</w:t>
+            </w:r>
+          </w:p>
+        </w:tc>
+        <w:tc>
+          <w:tcPr>
+            <w:tcW w:type="dxa" w:w="1400"/>
             <w:tcBorders>
               <w:top w:val="single" w:color="DDDDDD" w:sz="1"/>
               <w:left w:val="single" w:color="DDDDDD" w:sz="1"/>
@@ -2289,7 +2105,7 @@
                 <w:sz w:val="21"/>
                 <w:szCs w:val="21"/>
               </w:rPr>
-              <w:t xml:space="preserve">ארוחות בוקר שילדים אוהבים</w:t>
+              <w:t xml:space="preserve">comic</w:t>
             </w:r>
           </w:p>
         </w:tc>
@@ -2323,13 +2139,13 @@
                 <w:sz w:val="21"/>
                 <w:szCs w:val="21"/>
               </w:rPr>
-              <w:t xml:space="preserve">comic</w:t>
-            </w:r>
-          </w:p>
-        </w:tc>
-        <w:tc>
-          <w:tcPr>
-            <w:tcW w:type="dxa" w:w="1100"/>
+              <w:t xml:space="preserve">5</w:t>
+            </w:r>
+          </w:p>
+        </w:tc>
+        <w:tc>
+          <w:tcPr>
+            <w:tcW w:type="dxa" w:w="1400"/>
             <w:tcBorders>
               <w:top w:val="single" w:color="DDDDDD" w:sz="1"/>
               <w:left w:val="single" w:color="DDDDDD" w:sz="1"/>
@@ -2357,13 +2173,13 @@
                 <w:sz w:val="21"/>
                 <w:szCs w:val="21"/>
               </w:rPr>
-              <w:t xml:space="preserve">5</w:t>
-            </w:r>
-          </w:p>
-        </w:tc>
-        <w:tc>
-          <w:tcPr>
-            <w:tcW w:type="dxa" w:w="1300"/>
+              <w:t xml:space="preserve">10</w:t>
+            </w:r>
+          </w:p>
+        </w:tc>
+        <w:tc>
+          <w:tcPr>
+            <w:tcW w:type="dxa" w:w="1226"/>
             <w:tcBorders>
               <w:top w:val="single" w:color="DDDDDD" w:sz="1"/>
               <w:left w:val="single" w:color="DDDDDD" w:sz="1"/>
@@ -2371,246 +2187,6 @@
               <w:right w:val="single" w:color="DDDDDD" w:sz="1"/>
             </w:tcBorders>
             <w:shd w:fill="FFFFFF" w:val="clear"/>
-            <w:tcMar>
-              <w:top w:type="dxa" w:w="80"/>
-              <w:left w:type="dxa" w:w="120"/>
-              <w:bottom w:type="dxa" w:w="80"/>
-              <w:right w:type="dxa" w:w="120"/>
-            </w:tcMar>
-          </w:tcPr>
-          <w:p>
-            <w:pPr>
-              <w:jc w:val="right"/>
-            </w:pPr>
-            <w:r>
-              <w:rPr>
-                <w:rFonts w:ascii="Arial" w:cs="Arial" w:eastAsia="Arial" w:hAnsi="Arial"/>
-                <w:b w:val="false"/>
-                <w:bCs w:val="false"/>
-                <w:color w:val="333333"/>
-                <w:sz w:val="21"/>
-                <w:szCs w:val="21"/>
-              </w:rPr>
-              <w:t xml:space="preserve">10</w:t>
-            </w:r>
-          </w:p>
-        </w:tc>
-        <w:tc>
-          <w:tcPr>
-            <w:tcW w:type="dxa" w:w="1026"/>
-            <w:tcBorders>
-              <w:top w:val="single" w:color="DDDDDD" w:sz="1"/>
-              <w:left w:val="single" w:color="DDDDDD" w:sz="1"/>
-              <w:bottom w:val="single" w:color="DDDDDD" w:sz="1"/>
-              <w:right w:val="single" w:color="DDDDDD" w:sz="1"/>
-            </w:tcBorders>
-            <w:shd w:fill="FFFFFF" w:val="clear"/>
-            <w:tcMar>
-              <w:top w:type="dxa" w:w="80"/>
-              <w:left w:type="dxa" w:w="120"/>
-              <w:bottom w:type="dxa" w:w="80"/>
-              <w:right w:type="dxa" w:w="120"/>
-            </w:tcMar>
-          </w:tcPr>
-          <w:p>
-            <w:pPr>
-              <w:jc w:val="right"/>
-            </w:pPr>
-            <w:r>
-              <w:rPr>
-                <w:rFonts w:ascii="Arial" w:cs="Arial" w:eastAsia="Arial" w:hAnsi="Arial"/>
-                <w:b w:val="false"/>
-                <w:bCs w:val="false"/>
-                <w:color w:val="333333"/>
-                <w:sz w:val="21"/>
-                <w:szCs w:val="21"/>
-              </w:rPr>
-              <w:t xml:space="preserve">₪19.90</w:t>
-            </w:r>
-          </w:p>
-        </w:tc>
-      </w:tr>
-      <w:tr>
-        <w:tc>
-          <w:tcPr>
-            <w:tcW w:type="dxa" w:w="500"/>
-            <w:tcBorders>
-              <w:top w:val="single" w:color="DDDDDD" w:sz="1"/>
-              <w:left w:val="single" w:color="DDDDDD" w:sz="1"/>
-              <w:bottom w:val="single" w:color="DDDDDD" w:sz="1"/>
-              <w:right w:val="single" w:color="DDDDDD" w:sz="1"/>
-            </w:tcBorders>
-            <w:shd w:fill="f0f7f2" w:val="clear"/>
-            <w:tcMar>
-              <w:top w:type="dxa" w:w="80"/>
-              <w:left w:type="dxa" w:w="120"/>
-              <w:bottom w:type="dxa" w:w="80"/>
-              <w:right w:type="dxa" w:w="120"/>
-            </w:tcMar>
-          </w:tcPr>
-          <w:p>
-            <w:pPr>
-              <w:jc w:val="right"/>
-            </w:pPr>
-            <w:r>
-              <w:rPr>
-                <w:rFonts w:ascii="Arial" w:cs="Arial" w:eastAsia="Arial" w:hAnsi="Arial"/>
-                <w:b w:val="false"/>
-                <w:bCs w:val="false"/>
-                <w:color w:val="333333"/>
-                <w:sz w:val="21"/>
-                <w:szCs w:val="21"/>
-              </w:rPr>
-              <w:t xml:space="preserve">3</w:t>
-            </w:r>
-          </w:p>
-        </w:tc>
-        <w:tc>
-          <w:tcPr>
-            <w:tcW w:type="dxa" w:w="3100"/>
-            <w:tcBorders>
-              <w:top w:val="single" w:color="DDDDDD" w:sz="1"/>
-              <w:left w:val="single" w:color="DDDDDD" w:sz="1"/>
-              <w:bottom w:val="single" w:color="DDDDDD" w:sz="1"/>
-              <w:right w:val="single" w:color="DDDDDD" w:sz="1"/>
-            </w:tcBorders>
-            <w:shd w:fill="f0f7f2" w:val="clear"/>
-            <w:tcMar>
-              <w:top w:type="dxa" w:w="80"/>
-              <w:left w:type="dxa" w:w="120"/>
-              <w:bottom w:type="dxa" w:w="80"/>
-              <w:right w:type="dxa" w:w="120"/>
-            </w:tcMar>
-          </w:tcPr>
-          <w:p>
-            <w:pPr>
-              <w:jc w:val="right"/>
-            </w:pPr>
-            <w:r>
-              <w:rPr>
-                <w:rFonts w:ascii="Arial" w:cs="Arial" w:eastAsia="Arial" w:hAnsi="Arial"/>
-                <w:b w:val="false"/>
-                <w:bCs w:val="false"/>
-                <w:color w:val="333333"/>
-                <w:sz w:val="21"/>
-                <w:szCs w:val="21"/>
-              </w:rPr>
-              <w:t xml:space="preserve">ניסויים פשוטים במטבח</w:t>
-            </w:r>
-          </w:p>
-        </w:tc>
-        <w:tc>
-          <w:tcPr>
-            <w:tcW w:type="dxa" w:w="1200"/>
-            <w:tcBorders>
-              <w:top w:val="single" w:color="DDDDDD" w:sz="1"/>
-              <w:left w:val="single" w:color="DDDDDD" w:sz="1"/>
-              <w:bottom w:val="single" w:color="DDDDDD" w:sz="1"/>
-              <w:right w:val="single" w:color="DDDDDD" w:sz="1"/>
-            </w:tcBorders>
-            <w:shd w:fill="f0f7f2" w:val="clear"/>
-            <w:tcMar>
-              <w:top w:type="dxa" w:w="80"/>
-              <w:left w:type="dxa" w:w="120"/>
-              <w:bottom w:type="dxa" w:w="80"/>
-              <w:right w:type="dxa" w:w="120"/>
-            </w:tcMar>
-          </w:tcPr>
-          <w:p>
-            <w:pPr>
-              <w:jc w:val="right"/>
-            </w:pPr>
-            <w:r>
-              <w:rPr>
-                <w:rFonts w:ascii="Arial" w:cs="Arial" w:eastAsia="Arial" w:hAnsi="Arial"/>
-                <w:b w:val="false"/>
-                <w:bCs w:val="false"/>
-                <w:color w:val="333333"/>
-                <w:sz w:val="21"/>
-                <w:szCs w:val="21"/>
-              </w:rPr>
-              <w:t xml:space="preserve">video</w:t>
-            </w:r>
-          </w:p>
-        </w:tc>
-        <w:tc>
-          <w:tcPr>
-            <w:tcW w:type="dxa" w:w="1100"/>
-            <w:tcBorders>
-              <w:top w:val="single" w:color="DDDDDD" w:sz="1"/>
-              <w:left w:val="single" w:color="DDDDDD" w:sz="1"/>
-              <w:bottom w:val="single" w:color="DDDDDD" w:sz="1"/>
-              <w:right w:val="single" w:color="DDDDDD" w:sz="1"/>
-            </w:tcBorders>
-            <w:shd w:fill="f0f7f2" w:val="clear"/>
-            <w:tcMar>
-              <w:top w:type="dxa" w:w="80"/>
-              <w:left w:type="dxa" w:w="120"/>
-              <w:bottom w:type="dxa" w:w="80"/>
-              <w:right w:type="dxa" w:w="120"/>
-            </w:tcMar>
-          </w:tcPr>
-          <w:p>
-            <w:pPr>
-              <w:jc w:val="right"/>
-            </w:pPr>
-            <w:r>
-              <w:rPr>
-                <w:rFonts w:ascii="Arial" w:cs="Arial" w:eastAsia="Arial" w:hAnsi="Arial"/>
-                <w:b w:val="false"/>
-                <w:bCs w:val="false"/>
-                <w:color w:val="333333"/>
-                <w:sz w:val="21"/>
-                <w:szCs w:val="21"/>
-              </w:rPr>
-              <w:t xml:space="preserve">5</w:t>
-            </w:r>
-          </w:p>
-        </w:tc>
-        <w:tc>
-          <w:tcPr>
-            <w:tcW w:type="dxa" w:w="1300"/>
-            <w:tcBorders>
-              <w:top w:val="single" w:color="DDDDDD" w:sz="1"/>
-              <w:left w:val="single" w:color="DDDDDD" w:sz="1"/>
-              <w:bottom w:val="single" w:color="DDDDDD" w:sz="1"/>
-              <w:right w:val="single" w:color="DDDDDD" w:sz="1"/>
-            </w:tcBorders>
-            <w:shd w:fill="f0f7f2" w:val="clear"/>
-            <w:tcMar>
-              <w:top w:type="dxa" w:w="80"/>
-              <w:left w:type="dxa" w:w="120"/>
-              <w:bottom w:type="dxa" w:w="80"/>
-              <w:right w:type="dxa" w:w="120"/>
-            </w:tcMar>
-          </w:tcPr>
-          <w:p>
-            <w:pPr>
-              <w:jc w:val="right"/>
-            </w:pPr>
-            <w:r>
-              <w:rPr>
-                <w:rFonts w:ascii="Arial" w:cs="Arial" w:eastAsia="Arial" w:hAnsi="Arial"/>
-                <w:b w:val="false"/>
-                <w:bCs w:val="false"/>
-                <w:color w:val="333333"/>
-                <w:sz w:val="21"/>
-                <w:szCs w:val="21"/>
-              </w:rPr>
-              <w:t xml:space="preserve">10</w:t>
-            </w:r>
-          </w:p>
-        </w:tc>
-        <w:tc>
-          <w:tcPr>
-            <w:tcW w:type="dxa" w:w="1026"/>
-            <w:tcBorders>
-              <w:top w:val="single" w:color="DDDDDD" w:sz="1"/>
-              <w:left w:val="single" w:color="DDDDDD" w:sz="1"/>
-              <w:bottom w:val="single" w:color="DDDDDD" w:sz="1"/>
-              <w:right w:val="single" w:color="DDDDDD" w:sz="1"/>
-            </w:tcBorders>
-            <w:shd w:fill="f0f7f2" w:val="clear"/>
             <w:tcMar>
               <w:top w:type="dxa" w:w="80"/>
               <w:left w:type="dxa" w:w="120"/>
@@ -2706,7 +2282,7 @@
                 <w:szCs w:val="21"/>
               </w:rPr>
               <w:t xml:space="preserve">5 מתכונים × 2 משחקונים = 10 שלבים לחבילה.
-כל חבילת פרימיום כוללת preview חינמי של משחקון 1 לפני רכישה.</w:t>
+כל חבילת פרימיום כוללת גם preview חינמי של משחקון 1 לפני רכישה.</w:t>
             </w:r>
           </w:p>
         </w:tc>
@@ -3362,7 +2938,7 @@
                 <w:sz w:val="21"/>
                 <w:szCs w:val="21"/>
               </w:rPr>
-              <w:t xml:space="preserve">כפתור דלג זמין</w:t>
+              <w:t xml:space="preserve">כפתור דלג זמין תמיד</w:t>
             </w:r>
           </w:p>
         </w:tc>
@@ -3432,7 +3008,7 @@
                 <w:sz w:val="21"/>
                 <w:szCs w:val="21"/>
               </w:rPr>
-              <w:t xml:space="preserve">רשימת 4 החבילות — FREE + 3 פרימיום</w:t>
+              <w:t xml:space="preserve">רשימת כל החבילות — חינם + פרימיום</w:t>
             </w:r>
           </w:p>
         </w:tc>
@@ -3536,7 +3112,7 @@
                 <w:sz w:val="21"/>
                 <w:szCs w:val="21"/>
               </w:rPr>
-              <w:t xml:space="preserve">מסך רכישה + Preview משחקון 1</w:t>
+              <w:t xml:space="preserve">מסך רכישת חבילה + Preview</w:t>
             </w:r>
           </w:p>
         </w:tc>
@@ -4162,7 +3738,7 @@
                 <w:sz w:val="21"/>
                 <w:szCs w:val="21"/>
               </w:rPr>
-              <w:t xml:space="preserve">מפת 5 תחנות + Parent Menu + נוכחות השף הירוק</w:t>
+              <w:t xml:space="preserve">מפת 5 תחנות + Parent Menu</w:t>
             </w:r>
           </w:p>
         </w:tc>
@@ -4431,7 +4007,7 @@
           <w:sz w:val="26"/>
           <w:szCs w:val="26"/>
         </w:rPr>
-        <w:t xml:space="preserve">4.1 Story Module — גמיש לפי חבילה</w:t>
+        <w:t xml:space="preserve">4.1 Story Module — מודול גמיש</w:t>
       </w:r>
     </w:p>
     <w:tbl>
@@ -4447,15 +4023,15 @@
         </w:tblBorders>
       </w:tblPr>
       <w:tblGrid>
-        <w:gridCol w:w="1600"/>
+        <w:gridCol w:w="1800"/>
         <w:gridCol w:w="2400"/>
-        <w:gridCol w:w="2400"/>
+        <w:gridCol w:w="2200"/>
         <w:gridCol w:w="2626"/>
       </w:tblGrid>
       <w:tr>
         <w:tc>
           <w:tcPr>
-            <w:tcW w:type="dxa" w:w="1600"/>
+            <w:tcW w:type="dxa" w:w="1800"/>
             <w:tcBorders>
               <w:top w:val="single" w:color="DDDDDD" w:sz="1"/>
               <w:left w:val="single" w:color="DDDDDD" w:sz="1"/>
@@ -4523,7 +4099,7 @@
         </w:tc>
         <w:tc>
           <w:tcPr>
-            <w:tcW w:type="dxa" w:w="2400"/>
+            <w:tcW w:type="dxa" w:w="2200"/>
             <w:tcBorders>
               <w:top w:val="single" w:color="DDDDDD" w:sz="1"/>
               <w:left w:val="single" w:color="DDDDDD" w:sz="1"/>
@@ -4585,7 +4161,7 @@
                 <w:sz w:val="21"/>
                 <w:szCs w:val="21"/>
               </w:rPr>
-              <w:t xml:space="preserve">חבילות</w:t>
+              <w:t xml:space="preserve">נמצא ב-</w:t>
             </w:r>
           </w:p>
         </w:tc>
@@ -4593,7 +4169,7 @@
       <w:tr>
         <w:tc>
           <w:tcPr>
-            <w:tcW w:type="dxa" w:w="1600"/>
+            <w:tcW w:type="dxa" w:w="1800"/>
             <w:tcBorders>
               <w:top w:val="single" w:color="DDDDDD" w:sz="1"/>
               <w:left w:val="single" w:color="DDDDDD" w:sz="1"/>
@@ -4661,7 +4237,7 @@
         </w:tc>
         <w:tc>
           <w:tcPr>
-            <w:tcW w:type="dxa" w:w="2400"/>
+            <w:tcW w:type="dxa" w:w="2200"/>
             <w:tcBorders>
               <w:top w:val="single" w:color="DDDDDD" w:sz="1"/>
               <w:left w:val="single" w:color="DDDDDD" w:sz="1"/>
@@ -4689,7 +4265,7 @@
                 <w:sz w:val="21"/>
                 <w:szCs w:val="21"/>
               </w:rPr>
-              <w:t xml:space="preserve">צפייה / דילוג / CTA מתחת</w:t>
+              <w:t xml:space="preserve">צפייה / דילוג</w:t>
             </w:r>
           </w:p>
         </w:tc>
@@ -4723,7 +4299,7 @@
                 <w:sz w:val="21"/>
                 <w:szCs w:val="21"/>
               </w:rPr>
-              <w:t xml:space="preserve">FREE, ערב, ניסויים</w:t>
+              <w:t xml:space="preserve">Dinner, FREE</w:t>
             </w:r>
           </w:p>
         </w:tc>
@@ -4731,7 +4307,7 @@
       <w:tr>
         <w:tc>
           <w:tcPr>
-            <w:tcW w:type="dxa" w:w="1600"/>
+            <w:tcW w:type="dxa" w:w="1800"/>
             <w:tcBorders>
               <w:top w:val="single" w:color="DDDDDD" w:sz="1"/>
               <w:left w:val="single" w:color="DDDDDD" w:sz="1"/>
@@ -4799,7 +4375,7 @@
         </w:tc>
         <w:tc>
           <w:tcPr>
-            <w:tcW w:type="dxa" w:w="2400"/>
+            <w:tcW w:type="dxa" w:w="2200"/>
             <w:tcBorders>
               <w:top w:val="single" w:color="DDDDDD" w:sz="1"/>
               <w:left w:val="single" w:color="DDDDDD" w:sz="1"/>
@@ -4827,7 +4403,7 @@
                 <w:sz w:val="21"/>
                 <w:szCs w:val="21"/>
               </w:rPr>
-              <w:t xml:space="preserve">מעבר בין פריימים + CTA בסיום</w:t>
+              <w:t xml:space="preserve">מעבר בין פריימים</w:t>
             </w:r>
           </w:p>
         </w:tc>
@@ -4861,7 +4437,7 @@
                 <w:sz w:val="21"/>
                 <w:szCs w:val="21"/>
               </w:rPr>
-              <w:t xml:space="preserve">בוקר</w:t>
+              <w:t xml:space="preserve">Breakfast</w:t>
             </w:r>
           </w:p>
         </w:tc>
@@ -4869,7 +4445,7 @@
       <w:tr>
         <w:tc>
           <w:tcPr>
-            <w:tcW w:type="dxa" w:w="1600"/>
+            <w:tcW w:type="dxa" w:w="1800"/>
             <w:tcBorders>
               <w:top w:val="single" w:color="DDDDDD" w:sz="1"/>
               <w:left w:val="single" w:color="DDDDDD" w:sz="1"/>
@@ -4937,7 +4513,7 @@
         </w:tc>
         <w:tc>
           <w:tcPr>
-            <w:tcW w:type="dxa" w:w="2400"/>
+            <w:tcW w:type="dxa" w:w="2200"/>
             <w:tcBorders>
               <w:top w:val="single" w:color="DDDDDD" w:sz="1"/>
               <w:left w:val="single" w:color="DDDDDD" w:sz="1"/>
@@ -5153,7 +4729,7 @@
           <w:sz w:val="22"/>
           <w:szCs w:val="22"/>
         </w:rPr>
-        <w:t xml:space="preserve">Title ייחודי לכל חבילה</w:t>
+        <w:t xml:space="preserve">Title: חשפו את המנות הסודיות</w:t>
       </w:r>
     </w:p>
     <w:p>
@@ -5208,6 +4784,48 @@
           <w:szCs w:val="22"/>
         </w:rPr>
         <w:t xml:space="preserve">Parent Menu entry — כפתור קבוע</w:t>
+      </w:r>
+    </w:p>
+    <w:p>
+      <w:pPr>
+        <w:spacing w:before="80"/>
+      </w:pPr>
+      <w:r>
+        <w:t xml:space="preserve"/>
+      </w:r>
+    </w:p>
+    <w:p>
+      <w:pPr>
+        <w:spacing w:after="80" w:before="160"/>
+      </w:pPr>
+      <w:r>
+        <w:rPr>
+          <w:rFonts w:ascii="Arial" w:cs="Arial" w:eastAsia="Arial" w:hAnsi="Arial"/>
+          <w:b/>
+          <w:bCs/>
+          <w:color w:val="333333"/>
+          <w:sz w:val="23"/>
+          <w:szCs w:val="23"/>
+        </w:rPr>
+        <w:t xml:space="preserve">שפת תחנות נעולות:</w:t>
+      </w:r>
+    </w:p>
+    <w:p>
+      <w:pPr>
+        <w:pStyle w:val="ListParagraph"/>
+        <w:numPr>
+          <w:ilvl w:val="0"/>
+          <w:numId w:val="2"/>
+        </w:numPr>
+        <w:spacing w:after="40" w:before="40"/>
+      </w:pPr>
+      <w:r>
+        <w:rPr>
+          <w:rFonts w:ascii="Arial" w:cs="Arial" w:eastAsia="Arial" w:hAnsi="Arial"/>
+          <w:sz w:val="22"/>
+          <w:szCs w:val="22"/>
+        </w:rPr>
+        <w:t xml:space="preserve">סודי / מחכה לגילוי / ייפתח בהמשך</w:t>
       </w:r>
     </w:p>
     <w:p>
@@ -6169,7 +5787,7 @@
                 <w:sz w:val="21"/>
                 <w:szCs w:val="21"/>
               </w:rPr>
-              <w:t xml:space="preserve">חיובי תמיד, גם בטעות</w:t>
+              <w:t xml:space="preserve">פידבק חיובי תמיד, גם בטעות</w:t>
             </w:r>
           </w:p>
         </w:tc>
@@ -7063,7 +6681,7 @@
                 <w:sz w:val="21"/>
                 <w:szCs w:val="21"/>
               </w:rPr>
-              <w:t xml:space="preserve">useWindowDimensions לכל layout</w:t>
+              <w:t xml:space="preserve">layout מותאם לטאבלט</w:t>
             </w:r>
           </w:p>
         </w:tc>
@@ -8749,7 +8367,7 @@
                 <w:sz w:val="21"/>
                 <w:szCs w:val="21"/>
               </w:rPr>
-              <w:t xml:space="preserve">number</w:t>
+              <w:t xml:space="preserve">19.90</w:t>
             </w:r>
           </w:p>
         </w:tc>
@@ -8783,7 +8401,7 @@
                 <w:sz w:val="21"/>
                 <w:szCs w:val="21"/>
               </w:rPr>
-              <w:t xml:space="preserve">19.90 לכל הפרימיום</w:t>
+              <w:t xml:space="preserve">מחיר ב-ILS</w:t>
             </w:r>
           </w:p>
         </w:tc>
@@ -9571,7 +9189,7 @@
                 <w:sz w:val="21"/>
                 <w:szCs w:val="21"/>
               </w:rPr>
-              <w:t xml:space="preserve">המסמך הזה</w:t>
+              <w:t xml:space="preserve">המסמך הזה — גרסה סופית</w:t>
             </w:r>
           </w:p>
         </w:tc>
@@ -9770,8 +9388,8 @@
       </w:tblPr>
       <w:tblGrid>
         <w:gridCol w:w="1400"/>
-        <w:gridCol w:w="4200"/>
-        <w:gridCol w:w="3426"/>
+        <w:gridCol w:w="4400"/>
+        <w:gridCol w:w="3226"/>
       </w:tblGrid>
       <w:tr>
         <w:tc>
@@ -9810,7 +9428,7 @@
         </w:tc>
         <w:tc>
           <w:tcPr>
-            <w:tcW w:type="dxa" w:w="4200"/>
+            <w:tcW w:type="dxa" w:w="4400"/>
             <w:tcBorders>
               <w:top w:val="single" w:color="DDDDDD" w:sz="1"/>
               <w:left w:val="single" w:color="DDDDDD" w:sz="1"/>
@@ -9844,7 +9462,7 @@
         </w:tc>
         <w:tc>
           <w:tcPr>
-            <w:tcW w:type="dxa" w:w="3426"/>
+            <w:tcW w:type="dxa" w:w="3226"/>
             <w:tcBorders>
               <w:top w:val="single" w:color="DDDDDD" w:sz="1"/>
               <w:left w:val="single" w:color="DDDDDD" w:sz="1"/>
@@ -9914,7 +9532,7 @@
         </w:tc>
         <w:tc>
           <w:tcPr>
-            <w:tcW w:type="dxa" w:w="4200"/>
+            <w:tcW w:type="dxa" w:w="4400"/>
             <w:tcBorders>
               <w:top w:val="single" w:color="DDDDDD" w:sz="1"/>
               <w:left w:val="single" w:color="DDDDDD" w:sz="1"/>
@@ -9948,7 +9566,7 @@
         </w:tc>
         <w:tc>
           <w:tcPr>
-            <w:tcW w:type="dxa" w:w="3426"/>
+            <w:tcW w:type="dxa" w:w="3226"/>
             <w:tcBorders>
               <w:top w:val="single" w:color="DDDDDD" w:sz="1"/>
               <w:left w:val="single" w:color="DDDDDD" w:sz="1"/>
@@ -10018,7 +9636,7 @@
         </w:tc>
         <w:tc>
           <w:tcPr>
-            <w:tcW w:type="dxa" w:w="4200"/>
+            <w:tcW w:type="dxa" w:w="4400"/>
             <w:tcBorders>
               <w:top w:val="single" w:color="DDDDDD" w:sz="1"/>
               <w:left w:val="single" w:color="DDDDDD" w:sz="1"/>
@@ -10052,7 +9670,7 @@
         </w:tc>
         <w:tc>
           <w:tcPr>
-            <w:tcW w:type="dxa" w:w="3426"/>
+            <w:tcW w:type="dxa" w:w="3226"/>
             <w:tcBorders>
               <w:top w:val="single" w:color="DDDDDD" w:sz="1"/>
               <w:left w:val="single" w:color="DDDDDD" w:sz="1"/>
@@ -10122,7 +9740,7 @@
         </w:tc>
         <w:tc>
           <w:tcPr>
-            <w:tcW w:type="dxa" w:w="4200"/>
+            <w:tcW w:type="dxa" w:w="4400"/>
             <w:tcBorders>
               <w:top w:val="single" w:color="DDDDDD" w:sz="1"/>
               <w:left w:val="single" w:color="DDDDDD" w:sz="1"/>
@@ -10150,13 +9768,13 @@
                 <w:sz w:val="21"/>
                 <w:szCs w:val="21"/>
               </w:rPr>
-              <w:t xml:space="preserve">RevenueCat, Paywall, Preview משחקון 1, Hub עם 4 חבילות</w:t>
-            </w:r>
-          </w:p>
-        </w:tc>
-        <w:tc>
-          <w:tcPr>
-            <w:tcW w:type="dxa" w:w="3426"/>
+              <w:t xml:space="preserve">RevenueCat, Paywall, Preview משחקון 1, Hub עם נעילה</w:t>
+            </w:r>
+          </w:p>
+        </w:tc>
+        <w:tc>
+          <w:tcPr>
+            <w:tcW w:type="dxa" w:w="3226"/>
             <w:tcBorders>
               <w:top w:val="single" w:color="DDDDDD" w:sz="1"/>
               <w:left w:val="single" w:color="DDDDDD" w:sz="1"/>
@@ -10226,7 +9844,7 @@
         </w:tc>
         <w:tc>
           <w:tcPr>
-            <w:tcW w:type="dxa" w:w="4200"/>
+            <w:tcW w:type="dxa" w:w="4400"/>
             <w:tcBorders>
               <w:top w:val="single" w:color="DDDDDD" w:sz="1"/>
               <w:left w:val="single" w:color="DDDDDD" w:sz="1"/>
@@ -10254,13 +9872,13 @@
                 <w:sz w:val="21"/>
                 <w:szCs w:val="21"/>
               </w:rPr>
-              <w:t xml:space="preserve">ארוחות ערב שילדים אוהבים (video) — 5 תחנות, 10 משחקונים</w:t>
-            </w:r>
-          </w:p>
-        </w:tc>
-        <w:tc>
-          <w:tcPr>
-            <w:tcW w:type="dxa" w:w="3426"/>
+              <w:t xml:space="preserve">Adventure Intro (video) + 5 תחנות + 10 משחקונים + Parent Menu</w:t>
+            </w:r>
+          </w:p>
+        </w:tc>
+        <w:tc>
+          <w:tcPr>
+            <w:tcW w:type="dxa" w:w="3226"/>
             <w:tcBorders>
               <w:top w:val="single" w:color="DDDDDD" w:sz="1"/>
               <w:left w:val="single" w:color="DDDDDD" w:sz="1"/>
@@ -10288,7 +9906,7 @@
                 <w:sz w:val="21"/>
                 <w:szCs w:val="21"/>
               </w:rPr>
-              <w:t xml:space="preserve">חבילה 1 מלאה</w:t>
+              <w:t xml:space="preserve">חבילת Dinner מלאה</w:t>
             </w:r>
           </w:p>
         </w:tc>
@@ -10330,7 +9948,7 @@
         </w:tc>
         <w:tc>
           <w:tcPr>
-            <w:tcW w:type="dxa" w:w="4200"/>
+            <w:tcW w:type="dxa" w:w="4400"/>
             <w:tcBorders>
               <w:top w:val="single" w:color="DDDDDD" w:sz="1"/>
               <w:left w:val="single" w:color="DDDDDD" w:sz="1"/>
@@ -10358,13 +9976,13 @@
                 <w:sz w:val="21"/>
                 <w:szCs w:val="21"/>
               </w:rPr>
-              <w:t xml:space="preserve">ארוחות בוקר שילדים אוהבים (comic) — 5 תחנות, 10 משחקונים</w:t>
-            </w:r>
-          </w:p>
-        </w:tc>
-        <w:tc>
-          <w:tcPr>
-            <w:tcW w:type="dxa" w:w="3426"/>
+              <w:t xml:space="preserve">Adventure Intro (comic/carousel) + 5 תחנות + 10 משחקונים</w:t>
+            </w:r>
+          </w:p>
+        </w:tc>
+        <w:tc>
+          <w:tcPr>
+            <w:tcW w:type="dxa" w:w="3226"/>
             <w:tcBorders>
               <w:top w:val="single" w:color="DDDDDD" w:sz="1"/>
               <w:left w:val="single" w:color="DDDDDD" w:sz="1"/>
@@ -10392,7 +10010,7 @@
                 <w:sz w:val="21"/>
                 <w:szCs w:val="21"/>
               </w:rPr>
-              <w:t xml:space="preserve">חבילה 2 מלאה</w:t>
+              <w:t xml:space="preserve">חבילת Breakfast מלאה</w:t>
             </w:r>
           </w:p>
         </w:tc>
@@ -10428,13 +10046,13 @@
                 <w:sz w:val="21"/>
                 <w:szCs w:val="21"/>
               </w:rPr>
-              <w:t xml:space="preserve">6 — Experiments</w:t>
-            </w:r>
-          </w:p>
-        </w:tc>
-        <w:tc>
-          <w:tcPr>
-            <w:tcW w:type="dxa" w:w="4200"/>
+              <w:t xml:space="preserve">6 — Stores</w:t>
+            </w:r>
+          </w:p>
+        </w:tc>
+        <w:tc>
+          <w:tcPr>
+            <w:tcW w:type="dxa" w:w="4400"/>
             <w:tcBorders>
               <w:top w:val="single" w:color="DDDDDD" w:sz="1"/>
               <w:left w:val="single" w:color="DDDDDD" w:sz="1"/>
@@ -10462,13 +10080,13 @@
                 <w:sz w:val="21"/>
                 <w:szCs w:val="21"/>
               </w:rPr>
-              <w:t xml:space="preserve">ניסויים פשוטים במטבח (video) — 5 תחנות, 10 משחקונים</w:t>
-            </w:r>
-          </w:p>
-        </w:tc>
-        <w:tc>
-          <w:tcPr>
-            <w:tcW w:type="dxa" w:w="3426"/>
+              <w:t xml:space="preserve">הגשה ל-App Store + Google Play</w:t>
+            </w:r>
+          </w:p>
+        </w:tc>
+        <w:tc>
+          <w:tcPr>
+            <w:tcW w:type="dxa" w:w="3226"/>
             <w:tcBorders>
               <w:top w:val="single" w:color="DDDDDD" w:sz="1"/>
               <w:left w:val="single" w:color="DDDDDD" w:sz="1"/>
@@ -10476,110 +10094,6 @@
               <w:right w:val="single" w:color="DDDDDD" w:sz="1"/>
             </w:tcBorders>
             <w:shd w:fill="f0f7f2" w:val="clear"/>
-            <w:tcMar>
-              <w:top w:type="dxa" w:w="80"/>
-              <w:left w:type="dxa" w:w="120"/>
-              <w:bottom w:type="dxa" w:w="80"/>
-              <w:right w:type="dxa" w:w="120"/>
-            </w:tcMar>
-          </w:tcPr>
-          <w:p>
-            <w:pPr>
-              <w:jc w:val="right"/>
-            </w:pPr>
-            <w:r>
-              <w:rPr>
-                <w:rFonts w:ascii="Arial" w:cs="Arial" w:eastAsia="Arial" w:hAnsi="Arial"/>
-                <w:b w:val="false"/>
-                <w:bCs w:val="false"/>
-                <w:color w:val="333333"/>
-                <w:sz w:val="21"/>
-                <w:szCs w:val="21"/>
-              </w:rPr>
-              <w:t xml:space="preserve">חבילה 3 מלאה</w:t>
-            </w:r>
-          </w:p>
-        </w:tc>
-      </w:tr>
-      <w:tr>
-        <w:tc>
-          <w:tcPr>
-            <w:tcW w:type="dxa" w:w="1400"/>
-            <w:tcBorders>
-              <w:top w:val="single" w:color="DDDDDD" w:sz="1"/>
-              <w:left w:val="single" w:color="DDDDDD" w:sz="1"/>
-              <w:bottom w:val="single" w:color="DDDDDD" w:sz="1"/>
-              <w:right w:val="single" w:color="DDDDDD" w:sz="1"/>
-            </w:tcBorders>
-            <w:shd w:fill="FFFFFF" w:val="clear"/>
-            <w:tcMar>
-              <w:top w:type="dxa" w:w="80"/>
-              <w:left w:type="dxa" w:w="120"/>
-              <w:bottom w:type="dxa" w:w="80"/>
-              <w:right w:type="dxa" w:w="120"/>
-            </w:tcMar>
-          </w:tcPr>
-          <w:p>
-            <w:pPr>
-              <w:jc w:val="right"/>
-            </w:pPr>
-            <w:r>
-              <w:rPr>
-                <w:rFonts w:ascii="Arial" w:cs="Arial" w:eastAsia="Arial" w:hAnsi="Arial"/>
-                <w:b w:val="false"/>
-                <w:bCs w:val="false"/>
-                <w:color w:val="333333"/>
-                <w:sz w:val="21"/>
-                <w:szCs w:val="21"/>
-              </w:rPr>
-              <w:t xml:space="preserve">7 — Stores</w:t>
-            </w:r>
-          </w:p>
-        </w:tc>
-        <w:tc>
-          <w:tcPr>
-            <w:tcW w:type="dxa" w:w="4200"/>
-            <w:tcBorders>
-              <w:top w:val="single" w:color="DDDDDD" w:sz="1"/>
-              <w:left w:val="single" w:color="DDDDDD" w:sz="1"/>
-              <w:bottom w:val="single" w:color="DDDDDD" w:sz="1"/>
-              <w:right w:val="single" w:color="DDDDDD" w:sz="1"/>
-            </w:tcBorders>
-            <w:shd w:fill="FFFFFF" w:val="clear"/>
-            <w:tcMar>
-              <w:top w:type="dxa" w:w="80"/>
-              <w:left w:type="dxa" w:w="120"/>
-              <w:bottom w:type="dxa" w:w="80"/>
-              <w:right w:type="dxa" w:w="120"/>
-            </w:tcMar>
-          </w:tcPr>
-          <w:p>
-            <w:pPr>
-              <w:jc w:val="right"/>
-            </w:pPr>
-            <w:r>
-              <w:rPr>
-                <w:rFonts w:ascii="Arial" w:cs="Arial" w:eastAsia="Arial" w:hAnsi="Arial"/>
-                <w:b w:val="false"/>
-                <w:bCs w:val="false"/>
-                <w:color w:val="333333"/>
-                <w:sz w:val="21"/>
-                <w:szCs w:val="21"/>
-              </w:rPr>
-              <w:t xml:space="preserve">הגשה ל-App Store + Google Play</w:t>
-            </w:r>
-          </w:p>
-        </w:tc>
-        <w:tc>
-          <w:tcPr>
-            <w:tcW w:type="dxa" w:w="3426"/>
-            <w:tcBorders>
-              <w:top w:val="single" w:color="DDDDDD" w:sz="1"/>
-              <w:left w:val="single" w:color="DDDDDD" w:sz="1"/>
-              <w:bottom w:val="single" w:color="DDDDDD" w:sz="1"/>
-              <w:right w:val="single" w:color="DDDDDD" w:sz="1"/>
-            </w:tcBorders>
-            <w:shd w:fill="FFFFFF" w:val="clear"/>
             <w:tcMar>
               <w:top w:type="dxa" w:w="80"/>
               <w:left w:type="dxa" w:w="120"/>
@@ -10627,7 +10141,7 @@
           <w:sz w:val="18"/>
           <w:szCs w:val="18"/>
         </w:rPr>
-        <w:t xml:space="preserve">── Developer Brief — גרסה סופית · 4 חבילות MVP · כל ההחלטות מאושרות ──</w:t>
+        <w:t xml:space="preserve">── Developer Brief — גרסה סופית · כל ההחלטות מאושרות ──</w:t>
       </w:r>
     </w:p>
     <w:sectPr>

</xml_diff>